<commit_message>
ajout d'insertions dans le script de la bd
</commit_message>
<xml_diff>
--- a/Liste de vérification_2026.docx
+++ b/Liste de vérification_2026.docx
@@ -161,6 +161,9 @@
             <w:pPr>
               <w:jc w:val="center"/>
             </w:pPr>
+            <w:r>
+              <w:t>x</w:t>
+            </w:r>
           </w:p>
         </w:tc>
         <w:tc>
@@ -276,6 +279,9 @@
             <w:pPr>
               <w:jc w:val="center"/>
             </w:pPr>
+            <w:r>
+              <w:t>x</w:t>
+            </w:r>
           </w:p>
         </w:tc>
         <w:tc>
@@ -567,7 +573,25 @@
                 <w:sz w:val="20"/>
                 <w:szCs w:val="20"/>
               </w:rPr>
-              <w:t>Les routes sont correctement documentées au format OpenAPI (description, paramètre, valeurs de retour).</w:t>
+              <w:t xml:space="preserve">Les routes sont correctement documentées au format </w:t>
+            </w:r>
+            <w:proofErr w:type="spellStart"/>
+            <w:r>
+              <w:rPr>
+                <w:rFonts w:asciiTheme="majorHAnsi" w:hAnsiTheme="majorHAnsi" w:cstheme="majorHAnsi"/>
+                <w:sz w:val="20"/>
+                <w:szCs w:val="20"/>
+              </w:rPr>
+              <w:t>OpenAPI</w:t>
+            </w:r>
+            <w:proofErr w:type="spellEnd"/>
+            <w:r>
+              <w:rPr>
+                <w:rFonts w:asciiTheme="majorHAnsi" w:hAnsiTheme="majorHAnsi" w:cstheme="majorHAnsi"/>
+                <w:sz w:val="20"/>
+                <w:szCs w:val="20"/>
+              </w:rPr>
+              <w:t xml:space="preserve"> (description, paramètre, valeurs de retour).</w:t>
             </w:r>
           </w:p>
         </w:tc>
@@ -817,6 +841,9 @@
             <w:pPr>
               <w:jc w:val="center"/>
             </w:pPr>
+            <w:r>
+              <w:t>x</w:t>
+            </w:r>
           </w:p>
         </w:tc>
         <w:tc>
@@ -1272,7 +1299,23 @@
                 <w:rFonts w:cstheme="minorHAnsi"/>
                 <w:lang w:val="en-CA"/>
               </w:rPr>
-              <w:t>4. Application de test (Toolpad Studio)</w:t>
+              <w:t>4. Application de test (</w:t>
+            </w:r>
+            <w:proofErr w:type="spellStart"/>
+            <w:r>
+              <w:rPr>
+                <w:rFonts w:cstheme="minorHAnsi"/>
+                <w:lang w:val="en-CA"/>
+              </w:rPr>
+              <w:t>Toolpad</w:t>
+            </w:r>
+            <w:proofErr w:type="spellEnd"/>
+            <w:r>
+              <w:rPr>
+                <w:rFonts w:cstheme="minorHAnsi"/>
+                <w:lang w:val="en-CA"/>
+              </w:rPr>
+              <w:t xml:space="preserve"> Studio)</w:t>
             </w:r>
           </w:p>
         </w:tc>
@@ -1554,6 +1597,9 @@
             <w:pPr>
               <w:jc w:val="center"/>
             </w:pPr>
+            <w:r>
+              <w:t>x</w:t>
+            </w:r>
           </w:p>
         </w:tc>
         <w:tc>
@@ -1598,8 +1644,18 @@
                 <w:sz w:val="20"/>
                 <w:szCs w:val="20"/>
               </w:rPr>
-              <w:t>La base de données est disponible en ligne. Attention à l’expiration des 30 jours pour PostgreSQL sur Render.com..</w:t>
-            </w:r>
+              <w:t xml:space="preserve">La base de données est disponible en ligne. Attention à l’expiration des 30 jours pour PostgreSQL sur </w:t>
+            </w:r>
+            <w:proofErr w:type="gramStart"/>
+            <w:r>
+              <w:rPr>
+                <w:rFonts w:asciiTheme="majorHAnsi" w:hAnsiTheme="majorHAnsi" w:cstheme="majorHAnsi"/>
+                <w:sz w:val="20"/>
+                <w:szCs w:val="20"/>
+              </w:rPr>
+              <w:t>Render.com..</w:t>
+            </w:r>
+            <w:proofErr w:type="gramEnd"/>
           </w:p>
         </w:tc>
         <w:tc>
@@ -1610,6 +1666,9 @@
             <w:pPr>
               <w:jc w:val="center"/>
             </w:pPr>
+            <w:r>
+              <w:t>x</w:t>
+            </w:r>
           </w:p>
         </w:tc>
         <w:tc>

</xml_diff>

<commit_message>
cocher les vérifications du service
</commit_message>
<xml_diff>
--- a/Liste de vérification_2026.docx
+++ b/Liste de vérification_2026.docx
@@ -361,6 +361,9 @@
             <w:pPr>
               <w:jc w:val="center"/>
             </w:pPr>
+            <w:r>
+              <w:t>`x</w:t>
+            </w:r>
           </w:p>
         </w:tc>
         <w:tc>
@@ -417,6 +420,9 @@
             <w:pPr>
               <w:jc w:val="center"/>
             </w:pPr>
+            <w:r>
+              <w:t>x</w:t>
+            </w:r>
           </w:p>
         </w:tc>
         <w:tc>
@@ -473,6 +479,9 @@
             <w:pPr>
               <w:jc w:val="center"/>
             </w:pPr>
+            <w:r>
+              <w:t>x</w:t>
+            </w:r>
           </w:p>
         </w:tc>
         <w:tc>
@@ -529,6 +538,9 @@
             <w:pPr>
               <w:jc w:val="center"/>
             </w:pPr>
+            <w:r>
+              <w:t>x</w:t>
+            </w:r>
           </w:p>
         </w:tc>
         <w:tc>
@@ -603,6 +615,9 @@
             <w:pPr>
               <w:jc w:val="center"/>
             </w:pPr>
+            <w:r>
+              <w:t>x</w:t>
+            </w:r>
           </w:p>
         </w:tc>
         <w:tc>
@@ -673,6 +688,9 @@
             <w:pPr>
               <w:jc w:val="center"/>
             </w:pPr>
+            <w:r>
+              <w:t>x</w:t>
+            </w:r>
           </w:p>
         </w:tc>
         <w:tc>
@@ -729,6 +747,9 @@
             <w:pPr>
               <w:jc w:val="center"/>
             </w:pPr>
+            <w:r>
+              <w:t>x</w:t>
+            </w:r>
           </w:p>
         </w:tc>
         <w:tc>
@@ -785,6 +806,9 @@
             <w:pPr>
               <w:jc w:val="center"/>
             </w:pPr>
+            <w:r>
+              <w:t>x</w:t>
+            </w:r>
           </w:p>
         </w:tc>
         <w:tc>
@@ -900,6 +924,9 @@
             <w:pPr>
               <w:jc w:val="center"/>
             </w:pPr>
+            <w:r>
+              <w:t>x</w:t>
+            </w:r>
           </w:p>
         </w:tc>
         <w:tc>
@@ -956,6 +983,9 @@
             <w:pPr>
               <w:jc w:val="center"/>
             </w:pPr>
+            <w:r>
+              <w:t>x</w:t>
+            </w:r>
           </w:p>
         </w:tc>
         <w:tc>
@@ -1012,6 +1042,9 @@
             <w:pPr>
               <w:jc w:val="center"/>
             </w:pPr>
+            <w:r>
+              <w:t>x</w:t>
+            </w:r>
           </w:p>
         </w:tc>
         <w:tc>
@@ -1471,6 +1504,9 @@
             <w:pPr>
               <w:jc w:val="center"/>
             </w:pPr>
+            <w:r>
+              <w:t>x</w:t>
+            </w:r>
           </w:p>
         </w:tc>
         <w:tc>
@@ -1541,6 +1577,9 @@
             <w:pPr>
               <w:jc w:val="center"/>
             </w:pPr>
+            <w:r>
+              <w:t>x</w:t>
+            </w:r>
           </w:p>
         </w:tc>
         <w:tc>
@@ -2641,6 +2680,23 @@
 </file>
 
 <file path=customXml/item1.xml><?xml version="1.0" encoding="utf-8"?>
+<?mso-contentType ?>
+<FormTemplates xmlns="http://schemas.microsoft.com/sharepoint/v3/contenttype/forms">
+  <Display>DocumentLibraryForm</Display>
+  <Edit>DocumentLibraryForm</Edit>
+  <New>DocumentLibraryForm</New>
+</FormTemplates>
+</file>
+
+<file path=customXml/item2.xml><?xml version="1.0" encoding="utf-8"?>
+<p:properties xmlns:p="http://schemas.microsoft.com/office/2006/metadata/properties" xmlns:xsi="http://www.w3.org/2001/XMLSchema-instance" xmlns:pc="http://schemas.microsoft.com/office/infopath/2007/PartnerControls">
+  <documentManagement>
+    <ReferenceId xmlns="fecbedc7-3678-4854-a0fa-b7a0730edfab" xsi:nil="true"/>
+  </documentManagement>
+</p:properties>
+</file>
+
+<file path=customXml/item3.xml><?xml version="1.0" encoding="utf-8"?>
 <ct:contentTypeSchema xmlns:ct="http://schemas.microsoft.com/office/2006/metadata/contentType" xmlns:ma="http://schemas.microsoft.com/office/2006/metadata/properties/metaAttributes" ct:_="" ma:_="" ma:contentTypeName="Document" ma:contentTypeID="0x01010095FD0977AA16B34898C7F08F4AA9AB9B" ma:contentTypeVersion="4" ma:contentTypeDescription="Crée un document." ma:contentTypeScope="" ma:versionID="05e18cd65ada5fa39c3f19ab6607ea96">
   <xsd:schema xmlns:xsd="http://www.w3.org/2001/XMLSchema" xmlns:xs="http://www.w3.org/2001/XMLSchema" xmlns:p="http://schemas.microsoft.com/office/2006/metadata/properties" xmlns:ns2="fecbedc7-3678-4854-a0fa-b7a0730edfab" targetNamespace="http://schemas.microsoft.com/office/2006/metadata/properties" ma:root="true" ma:fieldsID="fbcfa699519be5b52f9bca89797978be" ns2:_="">
     <xsd:import namespace="fecbedc7-3678-4854-a0fa-b7a0730edfab"/>
@@ -2784,24 +2840,25 @@
 </ct:contentTypeSchema>
 </file>
 
-<file path=customXml/item2.xml><?xml version="1.0" encoding="utf-8"?>
-<p:properties xmlns:p="http://schemas.microsoft.com/office/2006/metadata/properties" xmlns:xsi="http://www.w3.org/2001/XMLSchema-instance" xmlns:pc="http://schemas.microsoft.com/office/infopath/2007/PartnerControls">
-  <documentManagement>
-    <ReferenceId xmlns="fecbedc7-3678-4854-a0fa-b7a0730edfab" xsi:nil="true"/>
-  </documentManagement>
-</p:properties>
+<file path=customXml/itemProps1.xml><?xml version="1.0" encoding="utf-8"?>
+<ds:datastoreItem xmlns:ds="http://schemas.openxmlformats.org/officeDocument/2006/customXml" ds:itemID="{DC46A0E0-C510-4E40-AFC9-1C17AA976312}">
+  <ds:schemaRefs>
+    <ds:schemaRef ds:uri="http://schemas.microsoft.com/sharepoint/v3/contenttype/forms"/>
+  </ds:schemaRefs>
+</ds:datastoreItem>
 </file>
 
-<file path=customXml/item3.xml><?xml version="1.0" encoding="utf-8"?>
-<?mso-contentType ?>
-<FormTemplates xmlns="http://schemas.microsoft.com/sharepoint/v3/contenttype/forms">
-  <Display>DocumentLibraryForm</Display>
-  <Edit>DocumentLibraryForm</Edit>
-  <New>DocumentLibraryForm</New>
-</FormTemplates>
+<file path=customXml/itemProps2.xml><?xml version="1.0" encoding="utf-8"?>
+<ds:datastoreItem xmlns:ds="http://schemas.openxmlformats.org/officeDocument/2006/customXml" ds:itemID="{D296CD41-9BFB-4156-9D06-4B17CC5A9B2D}">
+  <ds:schemaRefs>
+    <ds:schemaRef ds:uri="http://schemas.microsoft.com/office/2006/metadata/properties"/>
+    <ds:schemaRef ds:uri="http://schemas.microsoft.com/office/infopath/2007/PartnerControls"/>
+    <ds:schemaRef ds:uri="fecbedc7-3678-4854-a0fa-b7a0730edfab"/>
+  </ds:schemaRefs>
+</ds:datastoreItem>
 </file>
 
-<file path=customXml/itemProps1.xml><?xml version="1.0" encoding="utf-8"?>
+<file path=customXml/itemProps3.xml><?xml version="1.0" encoding="utf-8"?>
 <ds:datastoreItem xmlns:ds="http://schemas.openxmlformats.org/officeDocument/2006/customXml" ds:itemID="{5D6CB8EF-B1C9-4F9F-88E8-AAAA2E29F03F}">
   <ds:schemaRefs>
     <ds:schemaRef ds:uri="http://schemas.microsoft.com/office/2006/metadata/contentType"/>
@@ -2817,22 +2874,4 @@
     <ds:schemaRef ds:uri="http://schemas.microsoft.com/internal/obd"/>
   </ds:schemaRefs>
 </ds:datastoreItem>
-</file>
-
-<file path=customXml/itemProps2.xml><?xml version="1.0" encoding="utf-8"?>
-<ds:datastoreItem xmlns:ds="http://schemas.openxmlformats.org/officeDocument/2006/customXml" ds:itemID="{D296CD41-9BFB-4156-9D06-4B17CC5A9B2D}">
-  <ds:schemaRefs>
-    <ds:schemaRef ds:uri="http://schemas.microsoft.com/office/2006/metadata/properties"/>
-    <ds:schemaRef ds:uri="http://schemas.microsoft.com/office/infopath/2007/PartnerControls"/>
-    <ds:schemaRef ds:uri="fecbedc7-3678-4854-a0fa-b7a0730edfab"/>
-  </ds:schemaRefs>
-</ds:datastoreItem>
-</file>
-
-<file path=customXml/itemProps3.xml><?xml version="1.0" encoding="utf-8"?>
-<ds:datastoreItem xmlns:ds="http://schemas.openxmlformats.org/officeDocument/2006/customXml" ds:itemID="{DC46A0E0-C510-4E40-AFC9-1C17AA976312}">
-  <ds:schemaRefs>
-    <ds:schemaRef ds:uri="http://schemas.microsoft.com/sharepoint/v3/contenttype/forms"/>
-  </ds:schemaRefs>
-</ds:datastoreItem>
 </file>
</xml_diff>

<commit_message>
ajout des vérifications de la page html
</commit_message>
<xml_diff>
--- a/Liste de vérification_2026.docx
+++ b/Liste de vérification_2026.docx
@@ -585,25 +585,7 @@
                 <w:sz w:val="20"/>
                 <w:szCs w:val="20"/>
               </w:rPr>
-              <w:t xml:space="preserve">Les routes sont correctement documentées au format </w:t>
-            </w:r>
-            <w:proofErr w:type="spellStart"/>
-            <w:r>
-              <w:rPr>
-                <w:rFonts w:asciiTheme="majorHAnsi" w:hAnsiTheme="majorHAnsi" w:cstheme="majorHAnsi"/>
-                <w:sz w:val="20"/>
-                <w:szCs w:val="20"/>
-              </w:rPr>
-              <w:t>OpenAPI</w:t>
-            </w:r>
-            <w:proofErr w:type="spellEnd"/>
-            <w:r>
-              <w:rPr>
-                <w:rFonts w:asciiTheme="majorHAnsi" w:hAnsiTheme="majorHAnsi" w:cstheme="majorHAnsi"/>
-                <w:sz w:val="20"/>
-                <w:szCs w:val="20"/>
-              </w:rPr>
-              <w:t xml:space="preserve"> (description, paramètre, valeurs de retour).</w:t>
+              <w:t>Les routes sont correctement documentées au format OpenAPI (description, paramètre, valeurs de retour).</w:t>
             </w:r>
           </w:p>
         </w:tc>
@@ -1115,6 +1097,9 @@
             <w:pPr>
               <w:jc w:val="center"/>
             </w:pPr>
+            <w:r>
+              <w:t>x</w:t>
+            </w:r>
           </w:p>
         </w:tc>
         <w:tc>
@@ -1171,6 +1156,9 @@
             <w:pPr>
               <w:jc w:val="center"/>
             </w:pPr>
+            <w:r>
+              <w:t>x</w:t>
+            </w:r>
           </w:p>
         </w:tc>
         <w:tc>
@@ -1245,6 +1233,9 @@
             <w:pPr>
               <w:jc w:val="center"/>
             </w:pPr>
+            <w:r>
+              <w:t>x</w:t>
+            </w:r>
           </w:p>
         </w:tc>
         <w:tc>
@@ -1301,6 +1292,9 @@
             <w:pPr>
               <w:jc w:val="center"/>
             </w:pPr>
+            <w:r>
+              <w:t>x</w:t>
+            </w:r>
           </w:p>
         </w:tc>
         <w:tc>
@@ -1332,23 +1326,7 @@
                 <w:rFonts w:cstheme="minorHAnsi"/>
                 <w:lang w:val="en-CA"/>
               </w:rPr>
-              <w:t>4. Application de test (</w:t>
-            </w:r>
-            <w:proofErr w:type="spellStart"/>
-            <w:r>
-              <w:rPr>
-                <w:rFonts w:cstheme="minorHAnsi"/>
-                <w:lang w:val="en-CA"/>
-              </w:rPr>
-              <w:t>Toolpad</w:t>
-            </w:r>
-            <w:proofErr w:type="spellEnd"/>
-            <w:r>
-              <w:rPr>
-                <w:rFonts w:cstheme="minorHAnsi"/>
-                <w:lang w:val="en-CA"/>
-              </w:rPr>
-              <w:t xml:space="preserve"> Studio)</w:t>
+              <w:t>4. Application de test (Toolpad Studio)</w:t>
             </w:r>
           </w:p>
         </w:tc>
@@ -1683,18 +1661,8 @@
                 <w:sz w:val="20"/>
                 <w:szCs w:val="20"/>
               </w:rPr>
-              <w:t xml:space="preserve">La base de données est disponible en ligne. Attention à l’expiration des 30 jours pour PostgreSQL sur </w:t>
-            </w:r>
-            <w:proofErr w:type="gramStart"/>
-            <w:r>
-              <w:rPr>
-                <w:rFonts w:asciiTheme="majorHAnsi" w:hAnsiTheme="majorHAnsi" w:cstheme="majorHAnsi"/>
-                <w:sz w:val="20"/>
-                <w:szCs w:val="20"/>
-              </w:rPr>
-              <w:t>Render.com..</w:t>
-            </w:r>
-            <w:proofErr w:type="gramEnd"/>
+              <w:t>La base de données est disponible en ligne. Attention à l’expiration des 30 jours pour PostgreSQL sur Render.com..</w:t>
+            </w:r>
           </w:p>
         </w:tc>
         <w:tc>
@@ -2680,20 +2648,20 @@
 </file>
 
 <file path=customXml/item1.xml><?xml version="1.0" encoding="utf-8"?>
+<p:properties xmlns:p="http://schemas.microsoft.com/office/2006/metadata/properties" xmlns:xsi="http://www.w3.org/2001/XMLSchema-instance" xmlns:pc="http://schemas.microsoft.com/office/infopath/2007/PartnerControls">
+  <documentManagement>
+    <ReferenceId xmlns="fecbedc7-3678-4854-a0fa-b7a0730edfab" xsi:nil="true"/>
+  </documentManagement>
+</p:properties>
+</file>
+
+<file path=customXml/item2.xml><?xml version="1.0" encoding="utf-8"?>
 <?mso-contentType ?>
 <FormTemplates xmlns="http://schemas.microsoft.com/sharepoint/v3/contenttype/forms">
   <Display>DocumentLibraryForm</Display>
   <Edit>DocumentLibraryForm</Edit>
   <New>DocumentLibraryForm</New>
 </FormTemplates>
-</file>
-
-<file path=customXml/item2.xml><?xml version="1.0" encoding="utf-8"?>
-<p:properties xmlns:p="http://schemas.microsoft.com/office/2006/metadata/properties" xmlns:xsi="http://www.w3.org/2001/XMLSchema-instance" xmlns:pc="http://schemas.microsoft.com/office/infopath/2007/PartnerControls">
-  <documentManagement>
-    <ReferenceId xmlns="fecbedc7-3678-4854-a0fa-b7a0730edfab" xsi:nil="true"/>
-  </documentManagement>
-</p:properties>
 </file>
 
 <file path=customXml/item3.xml><?xml version="1.0" encoding="utf-8"?>
@@ -2841,19 +2809,19 @@
 </file>
 
 <file path=customXml/itemProps1.xml><?xml version="1.0" encoding="utf-8"?>
-<ds:datastoreItem xmlns:ds="http://schemas.openxmlformats.org/officeDocument/2006/customXml" ds:itemID="{DC46A0E0-C510-4E40-AFC9-1C17AA976312}">
+<ds:datastoreItem xmlns:ds="http://schemas.openxmlformats.org/officeDocument/2006/customXml" ds:itemID="{D296CD41-9BFB-4156-9D06-4B17CC5A9B2D}">
   <ds:schemaRefs>
-    <ds:schemaRef ds:uri="http://schemas.microsoft.com/sharepoint/v3/contenttype/forms"/>
+    <ds:schemaRef ds:uri="http://schemas.microsoft.com/office/2006/metadata/properties"/>
+    <ds:schemaRef ds:uri="http://schemas.microsoft.com/office/infopath/2007/PartnerControls"/>
+    <ds:schemaRef ds:uri="fecbedc7-3678-4854-a0fa-b7a0730edfab"/>
   </ds:schemaRefs>
 </ds:datastoreItem>
 </file>
 
 <file path=customXml/itemProps2.xml><?xml version="1.0" encoding="utf-8"?>
-<ds:datastoreItem xmlns:ds="http://schemas.openxmlformats.org/officeDocument/2006/customXml" ds:itemID="{D296CD41-9BFB-4156-9D06-4B17CC5A9B2D}">
+<ds:datastoreItem xmlns:ds="http://schemas.openxmlformats.org/officeDocument/2006/customXml" ds:itemID="{DC46A0E0-C510-4E40-AFC9-1C17AA976312}">
   <ds:schemaRefs>
-    <ds:schemaRef ds:uri="http://schemas.microsoft.com/office/2006/metadata/properties"/>
-    <ds:schemaRef ds:uri="http://schemas.microsoft.com/office/infopath/2007/PartnerControls"/>
-    <ds:schemaRef ds:uri="fecbedc7-3678-4854-a0fa-b7a0730edfab"/>
+    <ds:schemaRef ds:uri="http://schemas.microsoft.com/sharepoint/v3/contenttype/forms"/>
   </ds:schemaRefs>
 </ds:datastoreItem>
 </file>

</xml_diff>